<commit_message>
feat: selaraskan tajuk Bab 8 kepada Kubur-Kubur Kita yang Kaku (🪦) v29
</commit_message>
<xml_diff>
--- a/Terjemahan_Al-Raqaiq_Penuh.docx
+++ b/Terjemahan_Al-Raqaiq_Penuh.docx
@@ -1162,7 +1162,7 @@
           <w:b/>
           <w:sz w:val="20"/>
         </w:rPr>
-        <w:t>BAB 8: BUKIT-BUKIT KITA YANG KAKU (تلالنا الهامدة)</w:t>
+        <w:t>BAB 8: KUBUR-KUBUR KITA YANG KAKU (تلالنا الهامدة)</w:t>
       </w:r>
       <w:r>
         <w:rPr>
@@ -13653,26 +13653,7 @@
         </w:rPr>
       </w:pPr>
       <w:r>
-        <w:rPr>
-          <w:b/>
-          <w:bCs/>
-        </w:rPr>
-        <w:lastRenderedPageBreak/>
-        <w:t xml:space="preserve">8: </w:t>
-      </w:r>
-      <w:r>
-        <w:rPr>
-          <w:b/>
-          <w:bCs/>
-        </w:rPr>
-        <w:t>Bukit-bukit</w:t>
-      </w:r>
-      <w:r>
-        <w:rPr>
-          <w:b/>
-          <w:bCs/>
-        </w:rPr>
-        <w:t xml:space="preserve"> Kita yang Kaku </w:t>
+        <w:t xml:space="preserve">8: Kubur-kubur Kita yang Kaku </w:t>
       </w:r>
     </w:p>
     <w:p>

</xml_diff>

<commit_message>
style: italic kan teks Bahasa Arab dalam nota kaki epigraf & baiki parsing fn v32
</commit_message>
<xml_diff>
--- a/Terjemahan_Al-Raqaiq_Penuh.docx
+++ b/Terjemahan_Al-Raqaiq_Penuh.docx
@@ -1951,6 +1951,56 @@
     <w:p>
       <w:r>
         <w:t>Kitab Al-Raqā'iq didahului oleh sebuah epigraf berupa lakaran seni lukisan abstrak Islam yang masyhur bertajuk "Penjara Harapan" (Ḥiṣār al-Amal). Lakaran ini diilhamkan secara langsung daripada hadis sahih Rasulullah SAW riwayat Abdullah bin Mas'ud RA (Sahih al-Bukhari) mengenai hakikat manusia yang terkurung di dalam kepungan ajal maut, manakala angan-angan kosongnya (al-amal) menjangkau jauh melintasi sempadan usia.</w:t>
+      </w:r>
+    </w:p>
+    <w:p>
+      <w:pPr>
+        <w:spacing w:before="160" w:after="80"/>
+      </w:pPr>
+      <w:r>
+        <w:rPr>
+          <w:sz w:val="19"/>
+        </w:rPr>
+        <w:t xml:space="preserve">[1] </w:t>
+      </w:r>
+      <w:r>
+        <w:rPr>
+          <w:i/>
+          <w:sz w:val="19"/>
+        </w:rPr>
+        <w:t>Ṣaḥīḥ al-Bukhārī</w:t>
+      </w:r>
+      <w:r>
+        <w:rPr>
+          <w:sz w:val="19"/>
+        </w:rPr>
+        <w:t>, no. 6417 (</w:t>
+      </w:r>
+      <w:r>
+        <w:rPr>
+          <w:i/>
+          <w:sz w:val="19"/>
+        </w:rPr>
+        <w:t>Kitāb al-Riqāq</w:t>
+      </w:r>
+      <w:r>
+        <w:rPr>
+          <w:sz w:val="19"/>
+        </w:rPr>
+        <w:t xml:space="preserve">, </w:t>
+      </w:r>
+      <w:r>
+        <w:rPr>
+          <w:i/>
+          <w:sz w:val="19"/>
+        </w:rPr>
+        <w:t>Bāb fī al-Amal wa Ṭūlih</w:t>
+      </w:r>
+      <w:r>
+        <w:rPr>
+          <w:sz w:val="19"/>
+        </w:rPr>
+        <w:t>).</w:t>
       </w:r>
     </w:p>
     <w:p>

</xml_diff>

<commit_message>
fix: buang kotak kosong Bab 6 ST 11, tambah kotak hijau teks Arab kata Imam al-Banna, PWA v39
</commit_message>
<xml_diff>
--- a/Terjemahan_Al-Raqaiq_Penuh.docx
+++ b/Terjemahan_Al-Raqaiq_Penuh.docx
@@ -10670,8 +10670,34 @@
       </w:r>
     </w:p>
     <w:p>
-      <w:r>
-        <w:t>( "Jadilah kamu seperti pohon; orang melemparkannya dengan batu, tetapi ia membalas mereka dengan buah." )</w:t>
+      <w:pPr>
+        <w:spacing w:before="120" w:after="80"/>
+        <w:jc w:val="center"/>
+      </w:pPr>
+      <w:r>
+        <w:rPr>
+          <w:rFonts w:ascii="Traditional Arabic" w:hAnsi="Traditional Arabic"/>
+          <w:b/>
+          <w:color w:val="1B4332"/>
+          <w:sz w:val="32"/>
+        </w:rPr>
+        <w:t>« كُونُوا كَالشَّجَرِ ، يَرْمِيهِ النَّاسُ بِالحَجَرِ ، وَيَرْمِيهِمْ بِالثَّمَرِ »</w:t>
+      </w:r>
+    </w:p>
+    <w:p>
+      <w:pPr>
+        <w:spacing w:before="40" w:after="120"/>
+        <w:ind w:left="360" w:right="360"/>
+        <w:jc w:val="both"/>
+      </w:pPr>
+      <w:r/>
+      <w:r>
+        <w:rPr>
+          <w:rFonts w:ascii="Times New Roman" w:hAnsi="Times New Roman"/>
+          <w:i/>
+          <w:sz w:val="24"/>
+        </w:rPr>
+        <w:t>“(Jadilah kamu seperti pohon; orang melemparkannya dengan batu, tetapi ia membalas mereka dengan buah.)”</w:t>
       </w:r>
     </w:p>
     <w:p>

</xml_diff>